<commit_message>
Fixed small errors in the review
</commit_message>
<xml_diff>
--- a/docs/Review-group-02_20260621.docx
+++ b/docs/Review-group-02_20260621.docx
@@ -197,13 +197,7 @@
               <w:rPr>
                 <w:lang w:val="en-GB"/>
               </w:rPr>
-              <w:t xml:space="preserve"> </w:t>
-            </w:r>
-            <w:r>
-              <w:rPr>
-                <w:lang w:val="en-GB"/>
-              </w:rPr>
-              <w:t xml:space="preserve">the chosen structure is fine. </w:t>
+              <w:t xml:space="preserve"> the chosen structure is fine. </w:t>
             </w:r>
             <w:r>
               <w:rPr>
@@ -709,14 +703,20 @@
               <w:rPr>
                 <w:lang w:val="en-GB"/>
               </w:rPr>
-              <w:t>dbrepo</w:t>
+              <w:t>DBRepo</w:t>
             </w:r>
             <w:proofErr w:type="spellEnd"/>
             <w:r>
               <w:rPr>
                 <w:lang w:val="en-GB"/>
               </w:rPr>
-              <w:t xml:space="preserve"> step comes before the load data into </w:t>
+              <w:t xml:space="preserve"> </w:t>
+            </w:r>
+            <w:r>
+              <w:rPr>
+                <w:lang w:val="en-GB"/>
+              </w:rPr>
+              <w:t xml:space="preserve">step comes before the load data into </w:t>
             </w:r>
             <w:proofErr w:type="spellStart"/>
             <w:r>
@@ -775,7 +775,13 @@
               <w:rPr>
                 <w:lang w:val="en-GB"/>
               </w:rPr>
-              <w:t>The file is complete.</w:t>
+              <w:t>This</w:t>
+            </w:r>
+            <w:r>
+              <w:rPr>
+                <w:lang w:val="en-GB"/>
+              </w:rPr>
+              <w:t xml:space="preserve"> file is complete.</w:t>
             </w:r>
           </w:p>
         </w:tc>
@@ -973,6 +979,7 @@
           <w:szCs w:val="28"/>
           <w:lang w:val="en-GB"/>
         </w:rPr>
+        <w:lastRenderedPageBreak/>
         <w:t>TUWRD deposits for model and generated data</w:t>
       </w:r>
     </w:p>
@@ -988,13 +995,13 @@
       </w:tblGrid>
       <w:tr>
         <w:trPr>
+          <w:cnfStyle w:val="100000000000" w:firstRow="1" w:lastRow="0" w:firstColumn="0" w:lastColumn="0" w:oddVBand="0" w:evenVBand="0" w:oddHBand="0" w:evenHBand="0" w:firstRowFirstColumn="0" w:firstRowLastColumn="0" w:lastRowFirstColumn="0" w:lastRowLastColumn="0"/>
           <w:trHeight w:val="300"/>
         </w:trPr>
         <w:tc>
           <w:tcPr>
             <w:cnfStyle w:val="001000000000" w:firstRow="0" w:lastRow="0" w:firstColumn="1" w:lastColumn="0" w:oddVBand="0" w:evenVBand="0" w:oddHBand="0" w:evenHBand="0" w:firstRowFirstColumn="0" w:firstRowLastColumn="0" w:lastRowFirstColumn="0" w:lastRowLastColumn="0"/>
             <w:tcW w:w="3020" w:type="dxa"/>
-            <w:tcMar/>
           </w:tcPr>
           <w:p>
             <w:pPr>
@@ -1016,12 +1023,11 @@
         </w:tc>
         <w:tc>
           <w:tcPr>
-            <w:cnfStyle w:val="000000000000" w:firstRow="0" w:lastRow="0" w:firstColumn="0" w:lastColumn="0" w:oddVBand="0" w:evenVBand="0" w:oddHBand="0" w:evenHBand="0" w:firstRowFirstColumn="0" w:firstRowLastColumn="0" w:lastRowFirstColumn="0" w:lastRowLastColumn="0"/>
             <w:tcW w:w="5906" w:type="dxa"/>
-            <w:tcMar/>
-          </w:tcPr>
-          <w:p>
-            <w:pPr>
+          </w:tcPr>
+          <w:p>
+            <w:pPr>
+              <w:cnfStyle w:val="100000000000" w:firstRow="1" w:lastRow="0" w:firstColumn="0" w:lastColumn="0" w:oddVBand="0" w:evenVBand="0" w:oddHBand="0" w:evenHBand="0" w:firstRowFirstColumn="0" w:firstRowLastColumn="0" w:lastRowFirstColumn="0" w:lastRowLastColumn="0"/>
               <w:rPr>
                 <w:sz w:val="24"/>
                 <w:szCs w:val="24"/>
@@ -1035,6 +1041,57 @@
                 <w:lang w:val="en-GB"/>
               </w:rPr>
               <w:t>Status</w:t>
+            </w:r>
+          </w:p>
+        </w:tc>
+      </w:tr>
+      <w:tr>
+        <w:trPr>
+          <w:cnfStyle w:val="000000100000" w:firstRow="0" w:lastRow="0" w:firstColumn="0" w:lastColumn="0" w:oddVBand="0" w:evenVBand="0" w:oddHBand="1" w:evenHBand="0" w:firstRowFirstColumn="0" w:firstRowLastColumn="0" w:lastRowFirstColumn="0" w:lastRowLastColumn="0"/>
+          <w:trHeight w:val="300"/>
+        </w:trPr>
+        <w:tc>
+          <w:tcPr>
+            <w:cnfStyle w:val="001000000000" w:firstRow="0" w:lastRow="0" w:firstColumn="1" w:lastColumn="0" w:oddVBand="0" w:evenVBand="0" w:oddHBand="0" w:evenHBand="0" w:firstRowFirstColumn="0" w:firstRowLastColumn="0" w:lastRowFirstColumn="0" w:lastRowLastColumn="0"/>
+            <w:tcW w:w="3020" w:type="dxa"/>
+          </w:tcPr>
+          <w:p>
+            <w:pPr>
+              <w:rPr>
+                <w:lang w:val="en-GB"/>
+              </w:rPr>
+            </w:pPr>
+            <w:r>
+              <w:rPr>
+                <w:lang w:val="en-GB"/>
+              </w:rPr>
+              <w:t>Correct resource type</w:t>
+            </w:r>
+          </w:p>
+          <w:p>
+            <w:pPr>
+              <w:rPr>
+                <w:lang w:val="en-GB"/>
+              </w:rPr>
+            </w:pPr>
+          </w:p>
+        </w:tc>
+        <w:tc>
+          <w:tcPr>
+            <w:tcW w:w="5906" w:type="dxa"/>
+          </w:tcPr>
+          <w:p>
+            <w:pPr>
+              <w:cnfStyle w:val="000000100000" w:firstRow="0" w:lastRow="0" w:firstColumn="0" w:lastColumn="0" w:oddVBand="0" w:evenVBand="0" w:oddHBand="1" w:evenHBand="0" w:firstRowFirstColumn="0" w:firstRowLastColumn="0" w:lastRowFirstColumn="0" w:lastRowLastColumn="0"/>
+              <w:rPr>
+                <w:lang w:val="en-GB"/>
+              </w:rPr>
+            </w:pPr>
+            <w:r>
+              <w:rPr>
+                <w:lang w:val="en-GB"/>
+              </w:rPr>
+              <w:t xml:space="preserve">All are correct </w:t>
             </w:r>
           </w:p>
         </w:tc>
@@ -1047,247 +1104,146 @@
           <w:tcPr>
             <w:cnfStyle w:val="001000000000" w:firstRow="0" w:lastRow="0" w:firstColumn="1" w:lastColumn="0" w:oddVBand="0" w:evenVBand="0" w:oddHBand="0" w:evenHBand="0" w:firstRowFirstColumn="0" w:firstRowLastColumn="0" w:lastRowFirstColumn="0" w:lastRowLastColumn="0"/>
             <w:tcW w:w="3020" w:type="dxa"/>
-            <w:tcMar/>
-          </w:tcPr>
-          <w:p>
-            <w:pPr>
-              <w:rPr>
-                <w:lang w:val="en-GB"/>
-              </w:rPr>
-            </w:pPr>
-            <w:r>
-              <w:rPr>
-                <w:lang w:val="en-GB"/>
-              </w:rPr>
-              <w:t>Correct resource type</w:t>
-            </w:r>
-          </w:p>
-          <w:p>
-            <w:pPr>
-              <w:rPr>
-                <w:lang w:val="en-GB"/>
-              </w:rPr>
-            </w:pPr>
-          </w:p>
-        </w:tc>
-        <w:tc>
-          <w:tcPr>
-            <w:cnfStyle w:val="000000000000" w:firstRow="0" w:lastRow="0" w:firstColumn="0" w:lastColumn="0" w:oddVBand="0" w:evenVBand="0" w:oddHBand="0" w:evenHBand="0" w:firstRowFirstColumn="0" w:firstRowLastColumn="0" w:lastRowFirstColumn="0" w:lastRowLastColumn="0"/>
+          </w:tcPr>
+          <w:p>
+            <w:pPr>
+              <w:rPr>
+                <w:lang w:val="en-GB"/>
+              </w:rPr>
+            </w:pPr>
+            <w:r>
+              <w:rPr>
+                <w:lang w:val="en-GB"/>
+              </w:rPr>
+              <w:t xml:space="preserve">Crosslinks </w:t>
+            </w:r>
+          </w:p>
+        </w:tc>
+        <w:tc>
+          <w:tcPr>
             <w:tcW w:w="5906" w:type="dxa"/>
-            <w:tcMar/>
-          </w:tcPr>
-          <w:p>
-            <w:pPr>
-              <w:rPr>
-                <w:lang w:val="en-GB"/>
-              </w:rPr>
-            </w:pPr>
-            <w:r>
-              <w:rPr>
-                <w:lang w:val="en-GB"/>
-              </w:rPr>
-              <w:t xml:space="preserve">All are correct </w:t>
+          </w:tcPr>
+          <w:p>
+            <w:pPr>
+              <w:cnfStyle w:val="000000000000" w:firstRow="0" w:lastRow="0" w:firstColumn="0" w:lastColumn="0" w:oddVBand="0" w:evenVBand="0" w:oddHBand="0" w:evenHBand="0" w:firstRowFirstColumn="0" w:firstRowLastColumn="0" w:lastRowFirstColumn="0" w:lastRowLastColumn="0"/>
+              <w:rPr>
+                <w:lang w:val="en-GB"/>
+              </w:rPr>
+            </w:pPr>
+            <w:r>
+              <w:rPr>
+                <w:lang w:val="en-GB"/>
+              </w:rPr>
+              <w:t>The identifier for the model</w:t>
+            </w:r>
+            <w:r>
+              <w:rPr>
+                <w:lang w:val="en-GB"/>
+              </w:rPr>
+              <w:t xml:space="preserve"> </w:t>
+            </w:r>
+            <w:proofErr w:type="gramStart"/>
+            <w:r>
+              <w:rPr>
+                <w:lang w:val="en-GB"/>
+              </w:rPr>
+              <w:t>T</w:t>
+            </w:r>
+            <w:r>
+              <w:rPr>
+                <w:lang w:val="en-GB"/>
+              </w:rPr>
+              <w:t>3</w:t>
+            </w:r>
+            <w:r>
+              <w:rPr>
+                <w:lang w:val="en-GB"/>
+              </w:rPr>
+              <w:t>.10  is</w:t>
+            </w:r>
+            <w:proofErr w:type="gramEnd"/>
+            <w:r>
+              <w:rPr>
+                <w:lang w:val="en-GB"/>
+              </w:rPr>
+              <w:t xml:space="preserve"> a zenedo Doi while anot</w:t>
+            </w:r>
+            <w:r>
+              <w:rPr>
+                <w:lang w:val="en-GB"/>
+              </w:rPr>
+              <w:t>h</w:t>
+            </w:r>
+            <w:r>
+              <w:rPr>
+                <w:lang w:val="en-GB"/>
+              </w:rPr>
+              <w:t xml:space="preserve">er Doi is </w:t>
+            </w:r>
+            <w:r>
+              <w:rPr>
+                <w:lang w:val="en-GB"/>
+              </w:rPr>
+              <w:t xml:space="preserve">referenced </w:t>
+            </w:r>
+            <w:r>
+              <w:rPr>
+                <w:lang w:val="en-GB"/>
+              </w:rPr>
+              <w:t xml:space="preserve"> to </w:t>
+            </w:r>
+            <w:r>
+              <w:rPr>
+                <w:lang w:val="en-GB"/>
+              </w:rPr>
+              <w:t xml:space="preserve">the </w:t>
+            </w:r>
+            <w:r>
+              <w:rPr>
+                <w:lang w:val="en-GB"/>
+              </w:rPr>
+              <w:t xml:space="preserve">generated data </w:t>
+            </w:r>
+            <w:r>
+              <w:rPr>
+                <w:lang w:val="en-GB"/>
+              </w:rPr>
+              <w:t xml:space="preserve"> </w:t>
             </w:r>
           </w:p>
         </w:tc>
       </w:tr>
       <w:tr>
         <w:trPr>
+          <w:cnfStyle w:val="000000100000" w:firstRow="0" w:lastRow="0" w:firstColumn="0" w:lastColumn="0" w:oddVBand="0" w:evenVBand="0" w:oddHBand="1" w:evenHBand="0" w:firstRowFirstColumn="0" w:firstRowLastColumn="0" w:lastRowFirstColumn="0" w:lastRowLastColumn="0"/>
           <w:trHeight w:val="300"/>
         </w:trPr>
         <w:tc>
           <w:tcPr>
             <w:cnfStyle w:val="001000000000" w:firstRow="0" w:lastRow="0" w:firstColumn="1" w:lastColumn="0" w:oddVBand="0" w:evenVBand="0" w:oddHBand="0" w:evenHBand="0" w:firstRowFirstColumn="0" w:firstRowLastColumn="0" w:lastRowFirstColumn="0" w:lastRowLastColumn="0"/>
             <w:tcW w:w="3020" w:type="dxa"/>
-            <w:tcMar/>
-          </w:tcPr>
-          <w:p>
-            <w:pPr>
-              <w:rPr>
-                <w:lang w:val="en-GB"/>
-              </w:rPr>
-            </w:pPr>
-            <w:r>
-              <w:rPr>
-                <w:lang w:val="en-GB"/>
-              </w:rPr>
-              <w:t xml:space="preserve">Crosslinks </w:t>
-            </w:r>
-          </w:p>
-        </w:tc>
-        <w:tc>
-          <w:tcPr>
-            <w:cnfStyle w:val="000000000000" w:firstRow="0" w:lastRow="0" w:firstColumn="0" w:lastColumn="0" w:oddVBand="0" w:evenVBand="0" w:oddHBand="0" w:evenHBand="0" w:firstRowFirstColumn="0" w:firstRowLastColumn="0" w:lastRowFirstColumn="0" w:lastRowLastColumn="0"/>
+          </w:tcPr>
+          <w:p>
+            <w:pPr>
+              <w:rPr>
+                <w:lang w:val="en-GB"/>
+              </w:rPr>
+            </w:pPr>
+            <w:r>
+              <w:rPr>
+                <w:lang w:val="en-GB"/>
+              </w:rPr>
+              <w:t>Metadata</w:t>
+            </w:r>
+          </w:p>
+        </w:tc>
+        <w:tc>
+          <w:tcPr>
             <w:tcW w:w="5906" w:type="dxa"/>
-            <w:tcMar/>
-          </w:tcPr>
-          <w:p>
-            <w:pPr>
-              <w:pStyle w:val="Standard"/>
-              <w:suppressLineNumbers w:val="0"/>
-              <w:bidi w:val="0"/>
-              <w:spacing w:before="0" w:beforeAutospacing="off" w:after="0" w:afterAutospacing="off" w:line="240" w:lineRule="auto"/>
-              <w:ind w:left="0" w:right="0"/>
-              <w:jc w:val="left"/>
-              <w:rPr>
-                <w:lang w:val="en-GB"/>
-              </w:rPr>
-            </w:pPr>
-            <w:r>
-              <w:rPr>
-                <w:lang w:val="en-GB"/>
-              </w:rPr>
-              <w:t>The identifier for the model</w:t>
-            </w:r>
-            <w:r>
-              <w:rPr>
-                <w:lang w:val="en-GB"/>
-              </w:rPr>
-              <w:t xml:space="preserve"> </w:t>
-            </w:r>
-            <w:r>
-              <w:rPr>
-                <w:lang w:val="en-GB"/>
-              </w:rPr>
-              <w:t>T</w:t>
-            </w:r>
-            <w:r>
-              <w:rPr>
-                <w:lang w:val="en-GB"/>
-              </w:rPr>
-              <w:t>3</w:t>
-            </w:r>
-            <w:r>
-              <w:rPr>
-                <w:lang w:val="en-GB"/>
-              </w:rPr>
-              <w:t>.10  is</w:t>
-            </w:r>
-            <w:r>
-              <w:rPr>
-                <w:lang w:val="en-GB"/>
-              </w:rPr>
-              <w:t xml:space="preserve"> a </w:t>
-            </w:r>
-            <w:r>
-              <w:rPr>
-                <w:lang w:val="en-GB"/>
-              </w:rPr>
-              <w:t>zenedo</w:t>
-            </w:r>
-            <w:r>
-              <w:rPr>
-                <w:lang w:val="en-GB"/>
-              </w:rPr>
-              <w:t xml:space="preserve"> Doi while </w:t>
-            </w:r>
-            <w:r>
-              <w:rPr>
-                <w:lang w:val="en-GB"/>
-              </w:rPr>
-              <w:t>anot</w:t>
-            </w:r>
-            <w:r>
-              <w:rPr>
-                <w:lang w:val="en-GB"/>
-              </w:rPr>
-              <w:t>h</w:t>
-            </w:r>
-            <w:r>
-              <w:rPr>
-                <w:lang w:val="en-GB"/>
-              </w:rPr>
-              <w:t>er</w:t>
-            </w:r>
-            <w:r>
-              <w:rPr>
-                <w:lang w:val="en-GB"/>
-              </w:rPr>
-              <w:t xml:space="preserve"> Doi is </w:t>
-            </w:r>
-            <w:r>
-              <w:rPr>
-                <w:lang w:val="en-GB"/>
-              </w:rPr>
-              <w:t xml:space="preserve">referenced </w:t>
-            </w:r>
-            <w:r>
-              <w:rPr>
-                <w:lang w:val="en-GB"/>
-              </w:rPr>
-              <w:t xml:space="preserve"> to</w:t>
-            </w:r>
-            <w:r>
-              <w:rPr>
-                <w:lang w:val="en-GB"/>
-              </w:rPr>
-              <w:t xml:space="preserve"> </w:t>
-            </w:r>
-            <w:r>
-              <w:rPr>
-                <w:lang w:val="en-GB"/>
-              </w:rPr>
-              <w:t xml:space="preserve">the </w:t>
-            </w:r>
-            <w:r>
-              <w:rPr>
-                <w:lang w:val="en-GB"/>
-              </w:rPr>
-              <w:t xml:space="preserve">generated data </w:t>
-            </w:r>
-            <w:r>
-              <w:rPr>
-                <w:lang w:val="en-GB"/>
-              </w:rPr>
-              <w:t xml:space="preserve"> </w:t>
-            </w:r>
-          </w:p>
-        </w:tc>
-      </w:tr>
-      <w:tr>
-        <w:trPr>
-          <w:trHeight w:val="300"/>
-        </w:trPr>
-        <w:tc>
-          <w:tcPr>
-            <w:cnfStyle w:val="001000000000" w:firstRow="0" w:lastRow="0" w:firstColumn="1" w:lastColumn="0" w:oddVBand="0" w:evenVBand="0" w:oddHBand="0" w:evenHBand="0" w:firstRowFirstColumn="0" w:firstRowLastColumn="0" w:lastRowFirstColumn="0" w:lastRowLastColumn="0"/>
-            <w:tcW w:w="3020" w:type="dxa"/>
-            <w:tcMar/>
-          </w:tcPr>
-          <w:p>
-            <w:pPr>
-              <w:pStyle w:val="Standard"/>
-              <w:suppressLineNumbers w:val="0"/>
-              <w:bidi w:val="0"/>
-              <w:spacing w:before="0" w:beforeAutospacing="off" w:after="0" w:afterAutospacing="off" w:line="240" w:lineRule="auto"/>
-              <w:ind w:left="0" w:right="0"/>
-              <w:jc w:val="left"/>
-              <w:rPr>
-                <w:lang w:val="en-GB"/>
-              </w:rPr>
-            </w:pPr>
-            <w:r>
-              <w:rPr>
-                <w:lang w:val="en-GB"/>
-              </w:rPr>
-              <w:t>Metadata</w:t>
-            </w:r>
-          </w:p>
-        </w:tc>
-        <w:tc>
-          <w:tcPr>
-            <w:cnfStyle w:val="000000000000" w:firstRow="0" w:lastRow="0" w:firstColumn="0" w:lastColumn="0" w:oddVBand="0" w:evenVBand="0" w:oddHBand="0" w:evenHBand="0" w:firstRowFirstColumn="0" w:firstRowLastColumn="0" w:lastRowFirstColumn="0" w:lastRowLastColumn="0"/>
-            <w:tcW w:w="5906" w:type="dxa"/>
-            <w:tcMar/>
-          </w:tcPr>
-          <w:p>
-            <w:pPr>
-              <w:pStyle w:val="Standard"/>
-              <w:suppressLineNumbers w:val="0"/>
-              <w:bidi w:val="0"/>
-              <w:spacing w:before="0" w:beforeAutospacing="off" w:after="0" w:afterAutospacing="off" w:line="240" w:lineRule="auto"/>
-              <w:ind w:left="0" w:right="0"/>
-              <w:jc w:val="left"/>
+          </w:tcPr>
+          <w:p>
+            <w:pPr>
+              <w:cnfStyle w:val="000000100000" w:firstRow="0" w:lastRow="0" w:firstColumn="0" w:lastColumn="0" w:oddVBand="0" w:evenVBand="0" w:oddHBand="1" w:evenHBand="0" w:firstRowFirstColumn="0" w:firstRowLastColumn="0" w:lastRowFirstColumn="0" w:lastRowLastColumn="0"/>
               <w:rPr>
                 <w:lang w:val="en-GB"/>
               </w:rPr>
@@ -1310,47 +1266,25 @@
               </w:rPr>
               <w:t xml:space="preserve">. The descriptions </w:t>
             </w:r>
+            <w:proofErr w:type="gramStart"/>
             <w:r>
               <w:rPr>
                 <w:lang w:val="en-GB"/>
               </w:rPr>
               <w:t>contains</w:t>
             </w:r>
-            <w:r>
-              <w:rPr>
-                <w:lang w:val="en-GB"/>
-              </w:rPr>
-              <w:t xml:space="preserve"> </w:t>
-            </w:r>
-            <w:r>
-              <w:rPr>
-                <w:lang w:val="en-GB"/>
-              </w:rPr>
-              <w:t>all</w:t>
-            </w:r>
-            <w:r>
-              <w:rPr>
-                <w:lang w:val="en-GB"/>
-              </w:rPr>
-              <w:t xml:space="preserve"> the details liste</w:t>
-            </w:r>
-            <w:r>
-              <w:rPr>
-                <w:lang w:val="en-GB"/>
-              </w:rPr>
-              <w:t xml:space="preserve">d and the </w:t>
-            </w:r>
-            <w:r>
-              <w:rPr>
-                <w:lang w:val="en-GB"/>
-              </w:rPr>
-              <w:t>creatos</w:t>
-            </w:r>
-            <w:r>
-              <w:rPr>
-                <w:lang w:val="en-GB"/>
-              </w:rPr>
-              <w:t xml:space="preserve"> name can be found also </w:t>
+            <w:proofErr w:type="gramEnd"/>
+            <w:r>
+              <w:rPr>
+                <w:lang w:val="en-GB"/>
+              </w:rPr>
+              <w:t xml:space="preserve"> all the details liste</w:t>
+            </w:r>
+            <w:r>
+              <w:rPr>
+                <w:lang w:val="en-GB"/>
+              </w:rPr>
+              <w:t xml:space="preserve">d and the creatos name can be found also </w:t>
             </w:r>
             <w:r>
               <w:rPr>
@@ -1364,7 +1298,9 @@
     </w:tbl>
     <w:p>
       <w:pPr>
-        <w:ind/>
+        <w:rPr>
+          <w:lang w:val="en-US"/>
+        </w:rPr>
       </w:pPr>
     </w:p>
     <w:p>
@@ -1419,50 +1355,10 @@
     </w:p>
     <w:p>
       <w:pPr>
-        <w:pStyle w:val="Listenabsatz"/>
-        <w:rPr>
-          <w:lang w:val="en-GB"/>
-        </w:rPr>
-      </w:pPr>
-    </w:p>
-    <w:p>
-      <w:pPr>
-        <w:rPr>
-          <w:lang w:val="en-GB"/>
-        </w:rPr>
-      </w:pPr>
-    </w:p>
-    <w:p>
-      <w:pPr>
-        <w:rPr>
-          <w:sz w:val="24"/>
-          <w:szCs w:val="24"/>
-          <w:lang w:val="en-GB"/>
-        </w:rPr>
-      </w:pPr>
-    </w:p>
-    <w:p>
-      <w:pPr>
-        <w:pStyle w:val="berschrift3"/>
-        <w:numPr>
-          <w:ilvl w:val="0"/>
-          <w:numId w:val="1"/>
-        </w:numPr>
-        <w:ind w:left="284"/>
-        <w:rPr>
-          <w:sz w:val="28"/>
-          <w:szCs w:val="28"/>
-          <w:lang w:val="en-GB"/>
-        </w:rPr>
-      </w:pPr>
-      <w:r>
-        <w:rPr>
-          <w:sz w:val="28"/>
-          <w:szCs w:val="28"/>
-          <w:lang w:val="en-GB"/>
-        </w:rPr>
-        <w:t>DMP record</w:t>
-      </w:r>
+        <w:rPr>
+          <w:lang w:val="en-GB"/>
+        </w:rPr>
+      </w:pPr>
     </w:p>
     <w:tbl>
       <w:tblPr>
@@ -1544,13 +1440,7 @@
               <w:rPr>
                 <w:lang w:val="en-GB"/>
               </w:rPr>
-              <w:t>S</w:t>
-            </w:r>
-            <w:r>
-              <w:rPr>
-                <w:lang w:val="en-GB"/>
-              </w:rPr>
-              <w:t>chema</w:t>
+              <w:t>Schema</w:t>
             </w:r>
           </w:p>
         </w:tc>
@@ -1569,25 +1459,7 @@
               <w:rPr>
                 <w:lang w:val="en-GB"/>
               </w:rPr>
-              <w:t>Overall,</w:t>
-            </w:r>
-            <w:r>
-              <w:rPr>
-                <w:lang w:val="en-GB"/>
-              </w:rPr>
-              <w:t xml:space="preserve"> the schema fits the data. </w:t>
-            </w:r>
-            <w:r>
-              <w:rPr>
-                <w:lang w:val="en-GB"/>
-              </w:rPr>
-              <w:t>However,</w:t>
-            </w:r>
-            <w:r>
-              <w:rPr>
-                <w:lang w:val="en-GB"/>
-              </w:rPr>
-              <w:t xml:space="preserve"> the columns </w:t>
+              <w:t xml:space="preserve">Overall, the schema fits the data. However, the columns </w:t>
             </w:r>
             <w:proofErr w:type="spellStart"/>
             <w:r>
@@ -1615,13 +1487,7 @@
               <w:rPr>
                 <w:lang w:val="en-GB"/>
               </w:rPr>
-              <w:t xml:space="preserve"> contain the same data, so one of them is redundant.</w:t>
-            </w:r>
-            <w:r>
-              <w:rPr>
-                <w:lang w:val="en-GB"/>
-              </w:rPr>
-              <w:t xml:space="preserve"> </w:t>
+              <w:t xml:space="preserve"> contain the same data, so one of them is redundant. </w:t>
             </w:r>
           </w:p>
         </w:tc>
@@ -1687,32 +1553,14 @@
               <w:rPr>
                 <w:lang w:val="en-GB"/>
               </w:rPr>
-              <w:t xml:space="preserve"> repository. However </w:t>
-            </w:r>
-            <w:r>
-              <w:rPr>
-                <w:lang w:val="en-GB"/>
-              </w:rPr>
-              <w:t xml:space="preserve">In the README it is mentioned that </w:t>
+              <w:t xml:space="preserve"> repository. However In the README it is mentioned that </w:t>
             </w:r>
             <w:proofErr w:type="gramStart"/>
             <w:r>
               <w:rPr>
                 <w:lang w:val="en-GB"/>
               </w:rPr>
-              <w:t>t</w:t>
-            </w:r>
-            <w:r>
-              <w:rPr>
-                <w:lang w:val="en-GB"/>
-              </w:rPr>
-              <w:t>he</w:t>
-            </w:r>
-            <w:r>
-              <w:rPr>
-                <w:lang w:val="en-GB"/>
-              </w:rPr>
-              <w:t xml:space="preserve"> ”</w:t>
+              <w:t>the ”</w:t>
             </w:r>
             <w:proofErr w:type="gramEnd"/>
             <w:r>
@@ -1733,19 +1581,7 @@
               <w:rPr>
                 <w:lang w:val="en-GB"/>
               </w:rPr>
-              <w:t xml:space="preserve">” view </w:t>
-            </w:r>
-            <w:r>
-              <w:rPr>
-                <w:lang w:val="en-GB"/>
-              </w:rPr>
-              <w:t xml:space="preserve"> </w:t>
-            </w:r>
-            <w:r>
-              <w:rPr>
-                <w:lang w:val="en-GB"/>
-              </w:rPr>
-              <w:t xml:space="preserve">is not implemented in </w:t>
+              <w:t xml:space="preserve">” view  is not implemented in </w:t>
             </w:r>
             <w:proofErr w:type="spellStart"/>
             <w:r>
@@ -1759,13 +1595,7 @@
               <w:rPr>
                 <w:lang w:val="en-GB"/>
               </w:rPr>
-              <w:t xml:space="preserve"> due to missing features, but it is</w:t>
-            </w:r>
-            <w:r>
-              <w:rPr>
-                <w:lang w:val="en-GB"/>
-              </w:rPr>
-              <w:t>.</w:t>
+              <w:t xml:space="preserve"> due to missing features, but it is.</w:t>
             </w:r>
           </w:p>
         </w:tc>
@@ -1808,111 +1638,21 @@
               <w:rPr>
                 <w:lang w:val="en-GB"/>
               </w:rPr>
-              <w:t xml:space="preserve">The concept and </w:t>
-            </w:r>
-            <w:r>
-              <w:rPr>
-                <w:lang w:val="en-GB"/>
-              </w:rPr>
-              <w:t>m</w:t>
-            </w:r>
-            <w:r>
-              <w:rPr>
-                <w:lang w:val="en-GB"/>
-              </w:rPr>
-              <w:t xml:space="preserve">easurement </w:t>
-            </w:r>
-            <w:r>
-              <w:rPr>
-                <w:lang w:val="en-GB"/>
-              </w:rPr>
-              <w:t>u</w:t>
-            </w:r>
-            <w:r>
-              <w:rPr>
-                <w:lang w:val="en-GB"/>
-              </w:rPr>
-              <w:t xml:space="preserve">nits are </w:t>
-            </w:r>
-            <w:r>
-              <w:rPr>
-                <w:lang w:val="en-GB"/>
-              </w:rPr>
-              <w:t>not visible</w:t>
-            </w:r>
-            <w:r>
-              <w:rPr>
-                <w:lang w:val="en-GB"/>
-              </w:rPr>
-              <w:t xml:space="preserve"> </w:t>
-            </w:r>
-            <w:r>
-              <w:rPr>
-                <w:lang w:val="en-GB"/>
-              </w:rPr>
-              <w:t xml:space="preserve">at all </w:t>
-            </w:r>
-            <w:r>
-              <w:rPr>
-                <w:lang w:val="en-GB"/>
-              </w:rPr>
-              <w:t xml:space="preserve">in both tables. </w:t>
-            </w:r>
-            <w:r>
-              <w:rPr>
-                <w:lang w:val="en-GB"/>
-              </w:rPr>
-              <w:t xml:space="preserve">But based on the Python notebook in the </w:t>
+              <w:t xml:space="preserve">The concept and measurement units are not visible at all in both tables. But based on the Python notebook in the </w:t>
             </w:r>
             <w:proofErr w:type="spellStart"/>
             <w:r>
               <w:rPr>
                 <w:lang w:val="en-GB"/>
               </w:rPr>
-              <w:t>G</w:t>
-            </w:r>
-            <w:r>
-              <w:rPr>
-                <w:lang w:val="en-GB"/>
-              </w:rPr>
-              <w:t>ithub</w:t>
+              <w:t>Github</w:t>
             </w:r>
             <w:proofErr w:type="spellEnd"/>
             <w:r>
               <w:rPr>
                 <w:lang w:val="en-GB"/>
               </w:rPr>
-              <w:t xml:space="preserve"> repository </w:t>
-            </w:r>
-            <w:r>
-              <w:rPr>
-                <w:lang w:val="en-GB"/>
-              </w:rPr>
-              <w:t xml:space="preserve">the </w:t>
-            </w:r>
-            <w:r>
-              <w:rPr>
-                <w:lang w:val="en-GB"/>
-              </w:rPr>
-              <w:t>measurement units</w:t>
-            </w:r>
-            <w:r>
-              <w:rPr>
-                <w:lang w:val="en-GB"/>
-              </w:rPr>
-              <w:t xml:space="preserve"> were successfully </w:t>
-            </w:r>
-            <w:r>
-              <w:rPr>
-                <w:lang w:val="en-GB"/>
-              </w:rPr>
-              <w:t>created</w:t>
-            </w:r>
-            <w:r>
-              <w:rPr>
-                <w:lang w:val="en-GB"/>
-              </w:rPr>
-              <w:t xml:space="preserve">, so maybe this is a </w:t>
+              <w:t xml:space="preserve"> repository the measurement units were successfully created, so maybe this is a </w:t>
             </w:r>
             <w:proofErr w:type="spellStart"/>
             <w:r>
@@ -1926,43 +1666,14 @@
               <w:rPr>
                 <w:lang w:val="en-GB"/>
               </w:rPr>
-              <w:t xml:space="preserve"> </w:t>
-            </w:r>
-            <w:r>
-              <w:rPr>
-                <w:lang w:val="en-GB"/>
-              </w:rPr>
-              <w:t xml:space="preserve">error. However, I cannot find a file for the upload of the semantic mappings. </w:t>
+              <w:t xml:space="preserve"> error. However, I cannot find a file for the upload of the semantic mappings. </w:t>
             </w:r>
             <w:r>
               <w:rPr>
                 <w:lang w:val="en-GB"/>
               </w:rPr>
               <w:br/>
-            </w:r>
-            <w:r>
-              <w:rPr>
-                <w:lang w:val="en-GB"/>
-              </w:rPr>
-              <w:t xml:space="preserve">The description is present for some </w:t>
-            </w:r>
-            <w:r>
-              <w:rPr>
-                <w:lang w:val="en-GB"/>
-              </w:rPr>
-              <w:t>columns but</w:t>
-            </w:r>
-            <w:r>
-              <w:rPr>
-                <w:lang w:val="en-GB"/>
-              </w:rPr>
-              <w:t xml:space="preserve"> missing for most of them</w:t>
-            </w:r>
-            <w:r>
-              <w:rPr>
-                <w:lang w:val="en-GB"/>
-              </w:rPr>
-              <w:t>.</w:t>
+              <w:t>The description is present for some columns but missing for most of them.</w:t>
             </w:r>
           </w:p>
         </w:tc>
@@ -2016,13 +1727,7 @@
               <w:rPr>
                 <w:lang w:val="en-GB"/>
               </w:rPr>
-              <w:t xml:space="preserve"> entry does not have an identifier.</w:t>
-            </w:r>
-            <w:r>
-              <w:rPr>
-                <w:lang w:val="en-GB"/>
-              </w:rPr>
-              <w:t xml:space="preserve"> </w:t>
+              <w:t xml:space="preserve"> entry does not have an identifier. </w:t>
             </w:r>
           </w:p>
         </w:tc>
@@ -2030,28 +1735,67 @@
     </w:tbl>
     <w:p>
       <w:pPr>
-        <w:pStyle w:val="Listenabsatz"/>
-        <w:rPr>
-          <w:lang w:val="en-GB"/>
+        <w:rPr>
+          <w:lang w:val="en-US"/>
         </w:rPr>
       </w:pPr>
     </w:p>
     <w:p>
       <w:pPr>
         <w:rPr>
+          <w:sz w:val="24"/>
+          <w:szCs w:val="24"/>
           <w:lang w:val="en-GB"/>
         </w:rPr>
       </w:pPr>
     </w:p>
     <w:p>
       <w:pPr>
-        <w:rPr>
-          <w:lang w:val="en-GB"/>
-        </w:rPr>
-      </w:pPr>
+        <w:pStyle w:val="berschrift3"/>
+        <w:numPr>
+          <w:ilvl w:val="0"/>
+          <w:numId w:val="1"/>
+        </w:numPr>
+        <w:ind w:left="284"/>
+        <w:rPr>
+          <w:sz w:val="28"/>
+          <w:szCs w:val="28"/>
+          <w:lang w:val="en-GB"/>
+        </w:rPr>
+      </w:pPr>
+      <w:r>
+        <w:rPr>
+          <w:sz w:val="28"/>
+          <w:szCs w:val="28"/>
+          <w:lang w:val="en-GB"/>
+        </w:rPr>
+        <w:t>DMP record</w:t>
+      </w:r>
     </w:p>
     <w:p>
       <w:pPr>
+        <w:pStyle w:val="Listenabsatz"/>
+        <w:rPr>
+          <w:lang w:val="en-GB"/>
+        </w:rPr>
+      </w:pPr>
+    </w:p>
+    <w:p>
+      <w:pPr>
+        <w:rPr>
+          <w:lang w:val="en-GB"/>
+        </w:rPr>
+      </w:pPr>
+    </w:p>
+    <w:p>
+      <w:pPr>
+        <w:rPr>
+          <w:lang w:val="en-GB"/>
+        </w:rPr>
+      </w:pPr>
+    </w:p>
+    <w:p>
+      <w:pPr>
         <w:pStyle w:val="berschrift2"/>
         <w:rPr>
           <w:sz w:val="36"/>
@@ -2065,31 +1809,7 @@
           <w:szCs w:val="36"/>
           <w:lang w:val="en-GB"/>
         </w:rPr>
-        <w:t>Part 0</w:t>
-      </w:r>
-      <w:r>
-        <w:rPr>
-          <w:sz w:val="36"/>
-          <w:szCs w:val="36"/>
-          <w:lang w:val="en-GB"/>
-        </w:rPr>
-        <w:t>2</w:t>
-      </w:r>
-      <w:r>
-        <w:rPr>
-          <w:sz w:val="36"/>
-          <w:szCs w:val="36"/>
-          <w:lang w:val="en-GB"/>
-        </w:rPr>
-        <w:t xml:space="preserve">: </w:t>
-      </w:r>
-      <w:r>
-        <w:rPr>
-          <w:sz w:val="36"/>
-          <w:szCs w:val="36"/>
-          <w:lang w:val="en-GB"/>
-        </w:rPr>
-        <w:t>Reporting</w:t>
+        <w:t>Part 02: Reporting</w:t>
       </w:r>
       <w:r>
         <w:rPr>
@@ -2230,7 +1950,14 @@
               <w:rPr>
                 <w:lang w:val="en-GB"/>
               </w:rPr>
-              <w:t xml:space="preserve">All fields based on the FWF DMP template are present and most of them are written in detail for example III.1. Some sections are weaker, like the ethical aspects consist of only a single sentence, the administrative information does not designate a principal investigator or provide contact email addresses. Furthermore, IV.1 contains an internal contradiction, stating that the data will not be stored on the servers of TU Wien despite the described infrastructure, like </w:t>
+              <w:t xml:space="preserve">All fields based on the FWF DMP template are present and most of them are written in detail for example III.1. Some sections are weaker, like the ethical aspects consist of only a </w:t>
+            </w:r>
+            <w:r>
+              <w:rPr>
+                <w:lang w:val="en-GB"/>
+              </w:rPr>
+              <w:lastRenderedPageBreak/>
+              <w:t xml:space="preserve">single sentence, the administrative information does not designate a principal investigator or provide contact email addresses. Furthermore, IV.1 contains an internal contradiction, stating that the data will not be stored on the servers of TU Wien despite the described infrastructure, like </w:t>
             </w:r>
             <w:proofErr w:type="spellStart"/>
             <w:r>
@@ -2251,8 +1978,16 @@
       </w:tr>
     </w:tbl>
     <w:p>
-      <w:pPr/>
+      <w:pPr>
+        <w:rPr>
+          <w:lang w:val="en-US"/>
+        </w:rPr>
+      </w:pPr>
       <w:r>
+        <w:rPr>
+          <w:lang w:val="en-US"/>
+        </w:rPr>
+        <w:lastRenderedPageBreak/>
         <w:br/>
       </w:r>
     </w:p>
@@ -2310,13 +2045,13 @@
       </w:tblGrid>
       <w:tr>
         <w:trPr>
+          <w:cnfStyle w:val="100000000000" w:firstRow="1" w:lastRow="0" w:firstColumn="0" w:lastColumn="0" w:oddVBand="0" w:evenVBand="0" w:oddHBand="0" w:evenHBand="0" w:firstRowFirstColumn="0" w:firstRowLastColumn="0" w:lastRowFirstColumn="0" w:lastRowLastColumn="0"/>
           <w:trHeight w:val="300"/>
         </w:trPr>
         <w:tc>
           <w:tcPr>
             <w:cnfStyle w:val="001000000000" w:firstRow="0" w:lastRow="0" w:firstColumn="1" w:lastColumn="0" w:oddVBand="0" w:evenVBand="0" w:oddHBand="0" w:evenHBand="0" w:firstRowFirstColumn="0" w:firstRowLastColumn="0" w:lastRowFirstColumn="0" w:lastRowLastColumn="0"/>
             <w:tcW w:w="3020" w:type="dxa"/>
-            <w:tcMar/>
           </w:tcPr>
           <w:p>
             <w:pPr>
@@ -2338,12 +2073,11 @@
         </w:tc>
         <w:tc>
           <w:tcPr>
-            <w:cnfStyle w:val="000000000000" w:firstRow="0" w:lastRow="0" w:firstColumn="0" w:lastColumn="0" w:oddVBand="0" w:evenVBand="0" w:oddHBand="0" w:evenHBand="0" w:firstRowFirstColumn="0" w:firstRowLastColumn="0" w:lastRowFirstColumn="0" w:lastRowLastColumn="0"/>
             <w:tcW w:w="5906" w:type="dxa"/>
-            <w:tcMar/>
-          </w:tcPr>
-          <w:p>
-            <w:pPr>
+          </w:tcPr>
+          <w:p>
+            <w:pPr>
+              <w:cnfStyle w:val="100000000000" w:firstRow="1" w:lastRow="0" w:firstColumn="0" w:lastColumn="0" w:oddVBand="0" w:evenVBand="0" w:oddHBand="0" w:evenHBand="0" w:firstRowFirstColumn="0" w:firstRowLastColumn="0" w:lastRowFirstColumn="0" w:lastRowLastColumn="0"/>
               <w:rPr>
                 <w:sz w:val="24"/>
                 <w:szCs w:val="24"/>
@@ -2363,13 +2097,13 @@
       </w:tr>
       <w:tr>
         <w:trPr>
+          <w:cnfStyle w:val="000000100000" w:firstRow="0" w:lastRow="0" w:firstColumn="0" w:lastColumn="0" w:oddVBand="0" w:evenVBand="0" w:oddHBand="1" w:evenHBand="0" w:firstRowFirstColumn="0" w:firstRowLastColumn="0" w:lastRowFirstColumn="0" w:lastRowLastColumn="0"/>
           <w:trHeight w:val="300"/>
         </w:trPr>
         <w:tc>
           <w:tcPr>
             <w:cnfStyle w:val="001000000000" w:firstRow="0" w:lastRow="0" w:firstColumn="1" w:lastColumn="0" w:oddVBand="0" w:evenVBand="0" w:oddHBand="0" w:evenHBand="0" w:firstRowFirstColumn="0" w:firstRowLastColumn="0" w:lastRowFirstColumn="0" w:lastRowLastColumn="0"/>
             <w:tcW w:w="3020" w:type="dxa"/>
-            <w:tcMar/>
           </w:tcPr>
           <w:p>
             <w:pPr>
@@ -2387,43 +2121,21 @@
         </w:tc>
         <w:tc>
           <w:tcPr>
-            <w:cnfStyle w:val="000000000000" w:firstRow="0" w:lastRow="0" w:firstColumn="0" w:lastColumn="0" w:oddVBand="0" w:evenVBand="0" w:oddHBand="0" w:evenHBand="0" w:firstRowFirstColumn="0" w:firstRowLastColumn="0" w:lastRowFirstColumn="0" w:lastRowLastColumn="0"/>
             <w:tcW w:w="5906" w:type="dxa"/>
-            <w:tcMar/>
-          </w:tcPr>
-          <w:p>
-            <w:pPr>
-              <w:pStyle w:val="Standard"/>
-            </w:pPr>
-            <w:r>
-              <w:rPr>
-                <w:rFonts w:ascii="Calibri" w:hAnsi="Calibri" w:eastAsia="Calibri" w:cs="Calibri"/>
-                <w:noProof w:val="0"/>
-                <w:sz w:val="22"/>
-                <w:szCs w:val="22"/>
-                <w:lang w:val="en-GB"/>
-              </w:rPr>
-              <w:t xml:space="preserve">The project descriptions are well-structured, with each section contributing </w:t>
-            </w:r>
-            <w:r>
-              <w:rPr>
-                <w:rFonts w:ascii="Calibri" w:hAnsi="Calibri" w:eastAsia="Calibri" w:cs="Calibri"/>
-                <w:noProof w:val="0"/>
-                <w:sz w:val="22"/>
-                <w:szCs w:val="22"/>
-                <w:lang w:val="en-GB"/>
-              </w:rPr>
-              <w:t>a different perspective</w:t>
-            </w:r>
-            <w:r>
-              <w:rPr>
-                <w:rFonts w:ascii="Calibri" w:hAnsi="Calibri" w:eastAsia="Calibri" w:cs="Calibri"/>
-                <w:noProof w:val="0"/>
-                <w:sz w:val="22"/>
-                <w:szCs w:val="22"/>
-                <w:lang w:val="en-GB"/>
-              </w:rPr>
-              <w:t xml:space="preserve"> on the project's goals and approach. Together, they provide a comprehensive understanding of the project's purpose and expected outcomes.</w:t>
+          </w:tcPr>
+          <w:p>
+            <w:pPr>
+              <w:cnfStyle w:val="000000100000" w:firstRow="0" w:lastRow="0" w:firstColumn="0" w:lastColumn="0" w:oddVBand="0" w:evenVBand="0" w:oddHBand="1" w:evenHBand="0" w:firstRowFirstColumn="0" w:firstRowLastColumn="0" w:lastRowFirstColumn="0" w:lastRowLastColumn="0"/>
+              <w:rPr>
+                <w:lang w:val="en-US"/>
+              </w:rPr>
+            </w:pPr>
+            <w:r>
+              <w:rPr>
+                <w:rFonts w:ascii="Calibri" w:eastAsia="Calibri" w:hAnsi="Calibri" w:cs="Calibri"/>
+                <w:lang w:val="en-GB"/>
+              </w:rPr>
+              <w:t>The project descriptions are well-structured, with each section contributing a different perspective on the project's goals and approach. Together, they provide a comprehensive understanding of the project's purpose and expected outcomes.</w:t>
             </w:r>
           </w:p>
         </w:tc>
@@ -2438,7 +2150,7 @@
     </w:p>
     <w:sectPr>
       <w:headerReference w:type="default" r:id="rId7"/>
-      <w:pgSz w:w="11906" w:h="16838" w:orient="portrait"/>
+      <w:pgSz w:w="11906" w:h="16838"/>
       <w:pgMar w:top="1417" w:right="1417" w:bottom="1134" w:left="1417" w:header="708" w:footer="708" w:gutter="0"/>
       <w:cols w:space="708"/>
       <w:docGrid w:linePitch="360"/>
@@ -2511,8 +2223,6 @@
     </w:r>
     <w:r>
       <w:tab/>
-    </w:r>
-    <w:r>
       <w:t>22.06.2026</w:t>
     </w:r>
   </w:p>
@@ -2714,11 +2424,11 @@
 </file>
 
 <file path=word/styles.xml><?xml version="1.0" encoding="utf-8"?>
-<w:styles xmlns:wp14="http://schemas.microsoft.com/office/word/2010/wordprocessingDrawing" xmlns:mc="http://schemas.openxmlformats.org/markup-compatibility/2006" xmlns:r="http://schemas.openxmlformats.org/officeDocument/2006/relationships" xmlns:w="http://schemas.openxmlformats.org/wordprocessingml/2006/main" xmlns:w14="http://schemas.microsoft.com/office/word/2010/wordml" xmlns:w15="http://schemas.microsoft.com/office/word/2012/wordml" xmlns:w16cex="http://schemas.microsoft.com/office/word/2018/wordml/cex" xmlns:w16cid="http://schemas.microsoft.com/office/word/2016/wordml/cid" xmlns:w16="http://schemas.microsoft.com/office/word/2018/wordml" xmlns:w16du="http://schemas.microsoft.com/office/word/2023/wordml/word16du" xmlns:w16sdtdh="http://schemas.microsoft.com/office/word/2020/wordml/sdtdatahash" xmlns:w16se="http://schemas.microsoft.com/office/word/2015/wordml/symex" mc:Ignorable="w14 w15 w16se w16cid w16 w16cex w16sdtdh w16du wp14">
+<w:styles xmlns:mc="http://schemas.openxmlformats.org/markup-compatibility/2006" xmlns:r="http://schemas.openxmlformats.org/officeDocument/2006/relationships" xmlns:w="http://schemas.openxmlformats.org/wordprocessingml/2006/main" xmlns:w14="http://schemas.microsoft.com/office/word/2010/wordml" xmlns:w15="http://schemas.microsoft.com/office/word/2012/wordml" xmlns:w16cex="http://schemas.microsoft.com/office/word/2018/wordml/cex" xmlns:w16cid="http://schemas.microsoft.com/office/word/2016/wordml/cid" xmlns:w16="http://schemas.microsoft.com/office/word/2018/wordml" xmlns:w16du="http://schemas.microsoft.com/office/word/2023/wordml/word16du" xmlns:w16sdtdh="http://schemas.microsoft.com/office/word/2020/wordml/sdtdatahash" xmlns:w16se="http://schemas.microsoft.com/office/word/2015/wordml/symex" mc:Ignorable="w14 w15 w16se w16cid w16 w16cex w16sdtdh w16du">
   <w:docDefaults>
     <w:rPrDefault>
       <w:rPr>
-        <w:rFonts w:asciiTheme="minorHAnsi" w:hAnsiTheme="minorHAnsi" w:eastAsiaTheme="minorHAnsi" w:cstheme="minorBidi"/>
+        <w:rFonts w:asciiTheme="minorHAnsi" w:eastAsiaTheme="minorHAnsi" w:hAnsiTheme="minorHAnsi" w:cstheme="minorBidi"/>
         <w:kern w:val="2"/>
         <w:sz w:val="22"/>
         <w:szCs w:val="22"/>
@@ -2735,14 +2445,14 @@
   <w:latentStyles w:defLockedState="0" w:defUIPriority="99" w:defSemiHidden="0" w:defUnhideWhenUsed="0" w:defQFormat="0" w:count="376">
     <w:lsdException w:name="Normal" w:uiPriority="0" w:qFormat="1"/>
     <w:lsdException w:name="heading 1" w:uiPriority="9" w:qFormat="1"/>
-    <w:lsdException w:name="heading 2" w:uiPriority="9" w:semiHidden="1" w:unhideWhenUsed="1" w:qFormat="1"/>
-    <w:lsdException w:name="heading 3" w:uiPriority="9" w:semiHidden="1" w:unhideWhenUsed="1" w:qFormat="1"/>
-    <w:lsdException w:name="heading 4" w:uiPriority="9" w:semiHidden="1" w:unhideWhenUsed="1" w:qFormat="1"/>
-    <w:lsdException w:name="heading 5" w:uiPriority="9" w:semiHidden="1" w:unhideWhenUsed="1" w:qFormat="1"/>
-    <w:lsdException w:name="heading 6" w:uiPriority="9" w:semiHidden="1" w:unhideWhenUsed="1" w:qFormat="1"/>
-    <w:lsdException w:name="heading 7" w:uiPriority="9" w:semiHidden="1" w:unhideWhenUsed="1" w:qFormat="1"/>
-    <w:lsdException w:name="heading 8" w:uiPriority="9" w:semiHidden="1" w:unhideWhenUsed="1" w:qFormat="1"/>
-    <w:lsdException w:name="heading 9" w:uiPriority="9" w:semiHidden="1" w:unhideWhenUsed="1" w:qFormat="1"/>
+    <w:lsdException w:name="heading 2" w:semiHidden="1" w:uiPriority="9" w:unhideWhenUsed="1" w:qFormat="1"/>
+    <w:lsdException w:name="heading 3" w:semiHidden="1" w:uiPriority="9" w:unhideWhenUsed="1" w:qFormat="1"/>
+    <w:lsdException w:name="heading 4" w:semiHidden="1" w:uiPriority="9" w:unhideWhenUsed="1" w:qFormat="1"/>
+    <w:lsdException w:name="heading 5" w:semiHidden="1" w:uiPriority="9" w:unhideWhenUsed="1" w:qFormat="1"/>
+    <w:lsdException w:name="heading 6" w:semiHidden="1" w:uiPriority="9" w:unhideWhenUsed="1" w:qFormat="1"/>
+    <w:lsdException w:name="heading 7" w:semiHidden="1" w:uiPriority="9" w:unhideWhenUsed="1" w:qFormat="1"/>
+    <w:lsdException w:name="heading 8" w:semiHidden="1" w:uiPriority="9" w:unhideWhenUsed="1" w:qFormat="1"/>
+    <w:lsdException w:name="heading 9" w:semiHidden="1" w:uiPriority="9" w:unhideWhenUsed="1" w:qFormat="1"/>
     <w:lsdException w:name="index 1" w:semiHidden="1" w:unhideWhenUsed="1"/>
     <w:lsdException w:name="index 2" w:semiHidden="1" w:unhideWhenUsed="1"/>
     <w:lsdException w:name="index 3" w:semiHidden="1" w:unhideWhenUsed="1"/>
@@ -2752,22 +2462,22 @@
     <w:lsdException w:name="index 7" w:semiHidden="1" w:unhideWhenUsed="1"/>
     <w:lsdException w:name="index 8" w:semiHidden="1" w:unhideWhenUsed="1"/>
     <w:lsdException w:name="index 9" w:semiHidden="1" w:unhideWhenUsed="1"/>
-    <w:lsdException w:name="toc 1" w:uiPriority="39" w:semiHidden="1" w:unhideWhenUsed="1"/>
-    <w:lsdException w:name="toc 2" w:uiPriority="39" w:semiHidden="1" w:unhideWhenUsed="1"/>
-    <w:lsdException w:name="toc 3" w:uiPriority="39" w:semiHidden="1" w:unhideWhenUsed="1"/>
-    <w:lsdException w:name="toc 4" w:uiPriority="39" w:semiHidden="1" w:unhideWhenUsed="1"/>
-    <w:lsdException w:name="toc 5" w:uiPriority="39" w:semiHidden="1" w:unhideWhenUsed="1"/>
-    <w:lsdException w:name="toc 6" w:uiPriority="39" w:semiHidden="1" w:unhideWhenUsed="1"/>
-    <w:lsdException w:name="toc 7" w:uiPriority="39" w:semiHidden="1" w:unhideWhenUsed="1"/>
-    <w:lsdException w:name="toc 8" w:uiPriority="39" w:semiHidden="1" w:unhideWhenUsed="1"/>
-    <w:lsdException w:name="toc 9" w:uiPriority="39" w:semiHidden="1" w:unhideWhenUsed="1"/>
+    <w:lsdException w:name="toc 1" w:semiHidden="1" w:uiPriority="39" w:unhideWhenUsed="1"/>
+    <w:lsdException w:name="toc 2" w:semiHidden="1" w:uiPriority="39" w:unhideWhenUsed="1"/>
+    <w:lsdException w:name="toc 3" w:semiHidden="1" w:uiPriority="39" w:unhideWhenUsed="1"/>
+    <w:lsdException w:name="toc 4" w:semiHidden="1" w:uiPriority="39" w:unhideWhenUsed="1"/>
+    <w:lsdException w:name="toc 5" w:semiHidden="1" w:uiPriority="39" w:unhideWhenUsed="1"/>
+    <w:lsdException w:name="toc 6" w:semiHidden="1" w:uiPriority="39" w:unhideWhenUsed="1"/>
+    <w:lsdException w:name="toc 7" w:semiHidden="1" w:uiPriority="39" w:unhideWhenUsed="1"/>
+    <w:lsdException w:name="toc 8" w:semiHidden="1" w:uiPriority="39" w:unhideWhenUsed="1"/>
+    <w:lsdException w:name="toc 9" w:semiHidden="1" w:uiPriority="39" w:unhideWhenUsed="1"/>
     <w:lsdException w:name="Normal Indent" w:semiHidden="1" w:unhideWhenUsed="1"/>
     <w:lsdException w:name="footnote text" w:semiHidden="1" w:unhideWhenUsed="1"/>
     <w:lsdException w:name="annotation text" w:semiHidden="1" w:unhideWhenUsed="1"/>
     <w:lsdException w:name="header" w:semiHidden="1" w:unhideWhenUsed="1"/>
     <w:lsdException w:name="footer" w:semiHidden="1" w:unhideWhenUsed="1"/>
     <w:lsdException w:name="index heading" w:semiHidden="1" w:unhideWhenUsed="1"/>
-    <w:lsdException w:name="caption" w:uiPriority="35" w:semiHidden="1" w:unhideWhenUsed="1" w:qFormat="1"/>
+    <w:lsdException w:name="caption" w:semiHidden="1" w:uiPriority="35" w:unhideWhenUsed="1" w:qFormat="1"/>
     <w:lsdException w:name="table of figures" w:semiHidden="1" w:unhideWhenUsed="1"/>
     <w:lsdException w:name="envelope address" w:semiHidden="1" w:unhideWhenUsed="1"/>
     <w:lsdException w:name="envelope return" w:semiHidden="1" w:unhideWhenUsed="1"/>
@@ -2798,7 +2508,7 @@
     <w:lsdException w:name="Title" w:uiPriority="10" w:qFormat="1"/>
     <w:lsdException w:name="Closing" w:semiHidden="1" w:unhideWhenUsed="1"/>
     <w:lsdException w:name="Signature" w:semiHidden="1" w:unhideWhenUsed="1"/>
-    <w:lsdException w:name="Default Paragraph Font" w:uiPriority="1" w:semiHidden="1" w:unhideWhenUsed="1"/>
+    <w:lsdException w:name="Default Paragraph Font" w:semiHidden="1" w:uiPriority="1" w:unhideWhenUsed="1"/>
     <w:lsdException w:name="Body Text" w:semiHidden="1" w:unhideWhenUsed="1"/>
     <w:lsdException w:name="Body Text Indent" w:semiHidden="1" w:unhideWhenUsed="1"/>
     <w:lsdException w:name="List Continue" w:semiHidden="1" w:unhideWhenUsed="1"/>
@@ -2998,8 +2708,8 @@
     <w:lsdException w:name="Subtle Reference" w:uiPriority="31" w:qFormat="1"/>
     <w:lsdException w:name="Intense Reference" w:uiPriority="32" w:qFormat="1"/>
     <w:lsdException w:name="Book Title" w:uiPriority="33" w:qFormat="1"/>
-    <w:lsdException w:name="Bibliography" w:uiPriority="37" w:semiHidden="1" w:unhideWhenUsed="1"/>
-    <w:lsdException w:name="TOC Heading" w:uiPriority="39" w:semiHidden="1" w:unhideWhenUsed="1" w:qFormat="1"/>
+    <w:lsdException w:name="Bibliography" w:semiHidden="1" w:uiPriority="37" w:unhideWhenUsed="1"/>
+    <w:lsdException w:name="TOC Heading" w:semiHidden="1" w:uiPriority="39" w:unhideWhenUsed="1" w:qFormat="1"/>
     <w:lsdException w:name="Plain Table 1" w:uiPriority="41"/>
     <w:lsdException w:name="Plain Table 2" w:uiPriority="42"/>
     <w:lsdException w:name="Plain Table 3" w:uiPriority="43"/>
@@ -3110,7 +2820,7 @@
     <w:lsdException w:name="Unresolved Mention" w:semiHidden="1" w:unhideWhenUsed="1"/>
     <w:lsdException w:name="Smart Link" w:semiHidden="1" w:unhideWhenUsed="1"/>
   </w:latentStyles>
-  <w:style w:type="paragraph" w:styleId="Standard" w:default="1">
+  <w:style w:type="paragraph" w:default="1" w:styleId="Standard">
     <w:name w:val="Normal"/>
     <w:qFormat/>
   </w:style>
@@ -3129,7 +2839,7 @@
       <w:outlineLvl w:val="0"/>
     </w:pPr>
     <w:rPr>
-      <w:rFonts w:asciiTheme="majorHAnsi" w:hAnsiTheme="majorHAnsi" w:eastAsiaTheme="majorEastAsia" w:cstheme="majorBidi"/>
+      <w:rFonts w:asciiTheme="majorHAnsi" w:eastAsiaTheme="majorEastAsia" w:hAnsiTheme="majorHAnsi" w:cstheme="majorBidi"/>
       <w:color w:val="2F5496" w:themeColor="accent1" w:themeShade="BF"/>
       <w:sz w:val="32"/>
       <w:szCs w:val="32"/>
@@ -3151,7 +2861,7 @@
       <w:outlineLvl w:val="1"/>
     </w:pPr>
     <w:rPr>
-      <w:rFonts w:asciiTheme="majorHAnsi" w:hAnsiTheme="majorHAnsi" w:eastAsiaTheme="majorEastAsia" w:cstheme="majorBidi"/>
+      <w:rFonts w:asciiTheme="majorHAnsi" w:eastAsiaTheme="majorEastAsia" w:hAnsiTheme="majorHAnsi" w:cstheme="majorBidi"/>
       <w:color w:val="2F5496" w:themeColor="accent1" w:themeShade="BF"/>
       <w:sz w:val="26"/>
       <w:szCs w:val="26"/>
@@ -3173,19 +2883,19 @@
       <w:outlineLvl w:val="2"/>
     </w:pPr>
     <w:rPr>
-      <w:rFonts w:asciiTheme="majorHAnsi" w:hAnsiTheme="majorHAnsi" w:eastAsiaTheme="majorEastAsia" w:cstheme="majorBidi"/>
+      <w:rFonts w:asciiTheme="majorHAnsi" w:eastAsiaTheme="majorEastAsia" w:hAnsiTheme="majorHAnsi" w:cstheme="majorBidi"/>
       <w:color w:val="1F3763" w:themeColor="accent1" w:themeShade="7F"/>
       <w:sz w:val="24"/>
       <w:szCs w:val="24"/>
     </w:rPr>
   </w:style>
-  <w:style w:type="character" w:styleId="Absatz-Standardschriftart" w:default="1">
+  <w:style w:type="character" w:default="1" w:styleId="Absatz-Standardschriftart">
     <w:name w:val="Default Paragraph Font"/>
     <w:uiPriority w:val="1"/>
     <w:semiHidden/>
     <w:unhideWhenUsed/>
   </w:style>
-  <w:style w:type="table" w:styleId="NormaleTabelle" w:default="1">
+  <w:style w:type="table" w:default="1" w:styleId="NormaleTabelle">
     <w:name w:val="Normal Table"/>
     <w:uiPriority w:val="99"/>
     <w:semiHidden/>
@@ -3200,7 +2910,7 @@
       </w:tblCellMar>
     </w:tblPr>
   </w:style>
-  <w:style w:type="numbering" w:styleId="KeineListe" w:default="1">
+  <w:style w:type="numbering" w:default="1" w:styleId="KeineListe">
     <w:name w:val="No List"/>
     <w:uiPriority w:val="99"/>
     <w:semiHidden/>
@@ -3221,7 +2931,7 @@
       <w:spacing w:after="0" w:line="240" w:lineRule="auto"/>
     </w:pPr>
   </w:style>
-  <w:style w:type="character" w:styleId="KopfzeileZchn" w:customStyle="1">
+  <w:style w:type="character" w:customStyle="1" w:styleId="KopfzeileZchn">
     <w:name w:val="Kopfzeile Zchn"/>
     <w:basedOn w:val="Absatz-Standardschriftart"/>
     <w:link w:val="Kopfzeile"/>
@@ -3243,47 +2953,47 @@
       <w:spacing w:after="0" w:line="240" w:lineRule="auto"/>
     </w:pPr>
   </w:style>
-  <w:style w:type="character" w:styleId="FuzeileZchn" w:customStyle="1">
+  <w:style w:type="character" w:customStyle="1" w:styleId="FuzeileZchn">
     <w:name w:val="Fußzeile Zchn"/>
     <w:basedOn w:val="Absatz-Standardschriftart"/>
     <w:link w:val="Fuzeile"/>
     <w:uiPriority w:val="99"/>
     <w:rsid w:val="008C1942"/>
   </w:style>
-  <w:style w:type="character" w:styleId="berschrift1Zchn" w:customStyle="1">
+  <w:style w:type="character" w:customStyle="1" w:styleId="berschrift1Zchn">
     <w:name w:val="Überschrift 1 Zchn"/>
     <w:basedOn w:val="Absatz-Standardschriftart"/>
     <w:link w:val="berschrift1"/>
     <w:uiPriority w:val="9"/>
     <w:rsid w:val="008C1942"/>
     <w:rPr>
-      <w:rFonts w:asciiTheme="majorHAnsi" w:hAnsiTheme="majorHAnsi" w:eastAsiaTheme="majorEastAsia" w:cstheme="majorBidi"/>
+      <w:rFonts w:asciiTheme="majorHAnsi" w:eastAsiaTheme="majorEastAsia" w:hAnsiTheme="majorHAnsi" w:cstheme="majorBidi"/>
       <w:color w:val="2F5496" w:themeColor="accent1" w:themeShade="BF"/>
       <w:sz w:val="32"/>
       <w:szCs w:val="32"/>
     </w:rPr>
   </w:style>
-  <w:style w:type="character" w:styleId="berschrift2Zchn" w:customStyle="1">
+  <w:style w:type="character" w:customStyle="1" w:styleId="berschrift2Zchn">
     <w:name w:val="Überschrift 2 Zchn"/>
     <w:basedOn w:val="Absatz-Standardschriftart"/>
     <w:link w:val="berschrift2"/>
     <w:uiPriority w:val="9"/>
     <w:rsid w:val="008C1942"/>
     <w:rPr>
-      <w:rFonts w:asciiTheme="majorHAnsi" w:hAnsiTheme="majorHAnsi" w:eastAsiaTheme="majorEastAsia" w:cstheme="majorBidi"/>
+      <w:rFonts w:asciiTheme="majorHAnsi" w:eastAsiaTheme="majorEastAsia" w:hAnsiTheme="majorHAnsi" w:cstheme="majorBidi"/>
       <w:color w:val="2F5496" w:themeColor="accent1" w:themeShade="BF"/>
       <w:sz w:val="26"/>
       <w:szCs w:val="26"/>
     </w:rPr>
   </w:style>
-  <w:style w:type="character" w:styleId="berschrift3Zchn" w:customStyle="1">
+  <w:style w:type="character" w:customStyle="1" w:styleId="berschrift3Zchn">
     <w:name w:val="Überschrift 3 Zchn"/>
     <w:basedOn w:val="Absatz-Standardschriftart"/>
     <w:link w:val="berschrift3"/>
     <w:uiPriority w:val="9"/>
     <w:rsid w:val="008C1942"/>
     <w:rPr>
-      <w:rFonts w:asciiTheme="majorHAnsi" w:hAnsiTheme="majorHAnsi" w:eastAsiaTheme="majorEastAsia" w:cstheme="majorBidi"/>
+      <w:rFonts w:asciiTheme="majorHAnsi" w:eastAsiaTheme="majorEastAsia" w:hAnsiTheme="majorHAnsi" w:cstheme="majorBidi"/>
       <w:color w:val="1F3763" w:themeColor="accent1" w:themeShade="7F"/>
       <w:sz w:val="24"/>
       <w:szCs w:val="24"/>
@@ -3310,12 +3020,12 @@
     </w:pPr>
     <w:tblPr>
       <w:tblBorders>
-        <w:top w:val="single" w:color="auto" w:sz="4" w:space="0"/>
-        <w:left w:val="single" w:color="auto" w:sz="4" w:space="0"/>
-        <w:bottom w:val="single" w:color="auto" w:sz="4" w:space="0"/>
-        <w:right w:val="single" w:color="auto" w:sz="4" w:space="0"/>
-        <w:insideH w:val="single" w:color="auto" w:sz="4" w:space="0"/>
-        <w:insideV w:val="single" w:color="auto" w:sz="4" w:space="0"/>
+        <w:top w:val="single" w:sz="4" w:space="0" w:color="auto"/>
+        <w:left w:val="single" w:sz="4" w:space="0" w:color="auto"/>
+        <w:bottom w:val="single" w:sz="4" w:space="0" w:color="auto"/>
+        <w:right w:val="single" w:sz="4" w:space="0" w:color="auto"/>
+        <w:insideH w:val="single" w:sz="4" w:space="0" w:color="auto"/>
+        <w:insideV w:val="single" w:sz="4" w:space="0" w:color="auto"/>
       </w:tblBorders>
     </w:tblPr>
   </w:style>
@@ -3331,12 +3041,12 @@
       <w:tblStyleRowBandSize w:val="1"/>
       <w:tblStyleColBandSize w:val="1"/>
       <w:tblBorders>
-        <w:top w:val="single" w:color="BFBFBF" w:themeColor="background1" w:themeShade="BF" w:sz="4" w:space="0"/>
-        <w:left w:val="single" w:color="BFBFBF" w:themeColor="background1" w:themeShade="BF" w:sz="4" w:space="0"/>
-        <w:bottom w:val="single" w:color="BFBFBF" w:themeColor="background1" w:themeShade="BF" w:sz="4" w:space="0"/>
-        <w:right w:val="single" w:color="BFBFBF" w:themeColor="background1" w:themeShade="BF" w:sz="4" w:space="0"/>
-        <w:insideH w:val="single" w:color="BFBFBF" w:themeColor="background1" w:themeShade="BF" w:sz="4" w:space="0"/>
-        <w:insideV w:val="single" w:color="BFBFBF" w:themeColor="background1" w:themeShade="BF" w:sz="4" w:space="0"/>
+        <w:top w:val="single" w:sz="4" w:space="0" w:color="BFBFBF" w:themeColor="background1" w:themeShade="BF"/>
+        <w:left w:val="single" w:sz="4" w:space="0" w:color="BFBFBF" w:themeColor="background1" w:themeShade="BF"/>
+        <w:bottom w:val="single" w:sz="4" w:space="0" w:color="BFBFBF" w:themeColor="background1" w:themeShade="BF"/>
+        <w:right w:val="single" w:sz="4" w:space="0" w:color="BFBFBF" w:themeColor="background1" w:themeShade="BF"/>
+        <w:insideH w:val="single" w:sz="4" w:space="0" w:color="BFBFBF" w:themeColor="background1" w:themeShade="BF"/>
+        <w:insideV w:val="single" w:sz="4" w:space="0" w:color="BFBFBF" w:themeColor="background1" w:themeShade="BF"/>
       </w:tblBorders>
     </w:tblPr>
     <w:tblStylePr w:type="firstRow">
@@ -3353,7 +3063,7 @@
       <w:tblPr/>
       <w:tcPr>
         <w:tcBorders>
-          <w:top w:val="double" w:color="BFBFBF" w:themeColor="background1" w:themeShade="BF" w:sz="4" w:space="0"/>
+          <w:top w:val="double" w:sz="4" w:space="0" w:color="BFBFBF" w:themeColor="background1" w:themeShade="BF"/>
         </w:tcBorders>
       </w:tcPr>
     </w:tblStylePr>
@@ -3394,12 +3104,12 @@
       <w:tblStyleRowBandSize w:val="1"/>
       <w:tblStyleColBandSize w:val="1"/>
       <w:tblBorders>
-        <w:top w:val="single" w:color="9CC2E5" w:themeColor="accent5" w:themeTint="99" w:sz="4" w:space="0"/>
-        <w:left w:val="single" w:color="9CC2E5" w:themeColor="accent5" w:themeTint="99" w:sz="4" w:space="0"/>
-        <w:bottom w:val="single" w:color="9CC2E5" w:themeColor="accent5" w:themeTint="99" w:sz="4" w:space="0"/>
-        <w:right w:val="single" w:color="9CC2E5" w:themeColor="accent5" w:themeTint="99" w:sz="4" w:space="0"/>
-        <w:insideH w:val="single" w:color="9CC2E5" w:themeColor="accent5" w:themeTint="99" w:sz="4" w:space="0"/>
-        <w:insideV w:val="single" w:color="9CC2E5" w:themeColor="accent5" w:themeTint="99" w:sz="4" w:space="0"/>
+        <w:top w:val="single" w:sz="4" w:space="0" w:color="9CC2E5" w:themeColor="accent5" w:themeTint="99"/>
+        <w:left w:val="single" w:sz="4" w:space="0" w:color="9CC2E5" w:themeColor="accent5" w:themeTint="99"/>
+        <w:bottom w:val="single" w:sz="4" w:space="0" w:color="9CC2E5" w:themeColor="accent5" w:themeTint="99"/>
+        <w:right w:val="single" w:sz="4" w:space="0" w:color="9CC2E5" w:themeColor="accent5" w:themeTint="99"/>
+        <w:insideH w:val="single" w:sz="4" w:space="0" w:color="9CC2E5" w:themeColor="accent5" w:themeTint="99"/>
+        <w:insideV w:val="single" w:sz="4" w:space="0" w:color="9CC2E5" w:themeColor="accent5" w:themeTint="99"/>
       </w:tblBorders>
     </w:tblPr>
     <w:tblStylePr w:type="firstRow">
@@ -3411,10 +3121,10 @@
       <w:tblPr/>
       <w:tcPr>
         <w:tcBorders>
-          <w:top w:val="single" w:color="5B9BD5" w:themeColor="accent5" w:sz="4" w:space="0"/>
-          <w:left w:val="single" w:color="5B9BD5" w:themeColor="accent5" w:sz="4" w:space="0"/>
-          <w:bottom w:val="single" w:color="5B9BD5" w:themeColor="accent5" w:sz="4" w:space="0"/>
-          <w:right w:val="single" w:color="5B9BD5" w:themeColor="accent5" w:sz="4" w:space="0"/>
+          <w:top w:val="single" w:sz="4" w:space="0" w:color="5B9BD5" w:themeColor="accent5"/>
+          <w:left w:val="single" w:sz="4" w:space="0" w:color="5B9BD5" w:themeColor="accent5"/>
+          <w:bottom w:val="single" w:sz="4" w:space="0" w:color="5B9BD5" w:themeColor="accent5"/>
+          <w:right w:val="single" w:sz="4" w:space="0" w:color="5B9BD5" w:themeColor="accent5"/>
           <w:insideH w:val="nil"/>
           <w:insideV w:val="nil"/>
         </w:tcBorders>
@@ -3429,7 +3139,7 @@
       <w:tblPr/>
       <w:tcPr>
         <w:tcBorders>
-          <w:top w:val="double" w:color="5B9BD5" w:themeColor="accent5" w:sz="4" w:space="0"/>
+          <w:top w:val="double" w:sz="4" w:space="0" w:color="5B9BD5" w:themeColor="accent5"/>
         </w:tcBorders>
       </w:tcPr>
     </w:tblStylePr>
@@ -3458,7 +3168,7 @@
       </w:tcPr>
     </w:tblStylePr>
   </w:style>
-  <w:style w:type="character" w:styleId="mr-2" w:customStyle="1">
+  <w:style w:type="character" w:customStyle="1" w:styleId="mr-2">
     <w:name w:val="mr-2"/>
     <w:basedOn w:val="Absatz-Standardschriftart"/>
     <w:rsid w:val="00EB17CE"/>
@@ -3471,7 +3181,7 @@
     <w:unhideWhenUsed/>
     <w:rsid w:val="000E5CEC"/>
     <w:rPr>
-      <w:rFonts w:ascii="Courier New" w:hAnsi="Courier New" w:eastAsia="Times New Roman" w:cs="Courier New"/>
+      <w:rFonts w:ascii="Courier New" w:eastAsia="Times New Roman" w:hAnsi="Courier New" w:cs="Courier New"/>
       <w:sz w:val="20"/>
       <w:szCs w:val="20"/>
     </w:rPr>
@@ -3480,7 +3190,7 @@
 </file>
 
 <file path=word/theme/theme1.xml><?xml version="1.0" encoding="utf-8"?>
-<a:theme xmlns:a="http://schemas.openxmlformats.org/drawingml/2006/main" xmlns:thm15="http://schemas.microsoft.com/office/thememl/2012/main" name="Office">
+<a:theme xmlns:a="http://schemas.openxmlformats.org/drawingml/2006/main" name="Office">
   <a:themeElements>
     <a:clrScheme name="Office">
       <a:dk1>

</xml_diff>